<commit_message>
RAG Tutor v1.0 - complete package
</commit_message>
<xml_diff>
--- a/RAG_Tutor_Faculty_Guide.docx
+++ b/RAG_Tutor_Faculty_Guide.docx
@@ -33,10 +33,10 @@
           <w:b/>
           <w:bCs/>
           <w:color w:val="1E3A5F"/>
-          <w:sz w:val="48"/>
-          <w:szCs w:val="48"/>
-        </w:rPr>
-        <w:t xml:space="preserve">COP3337 Personalized Learning</w:t>
+          <w:sz w:val="56"/>
+          <w:szCs w:val="56"/>
+        </w:rPr>
+        <w:t xml:space="preserve">RAG Tutor</w:t>
       </w:r>
     </w:p>
     <w:p>
@@ -47,13 +47,11 @@
       <w:r>
         <w:rPr>
           <w:rFonts w:ascii="Arial" w:cs="Arial" w:eastAsia="Arial" w:hAnsi="Arial"/>
-          <w:b/>
-          <w:bCs/>
           <w:color w:val="3B82F6"/>
-          <w:sz w:val="48"/>
-          <w:szCs w:val="48"/>
-        </w:rPr>
-        <w:t xml:space="preserve">RAG Chatbot v2.0</w:t>
+          <w:sz w:val="36"/>
+          <w:szCs w:val="36"/>
+        </w:rPr>
+        <w:t xml:space="preserve">Personalized AI Learning Assistant</w:t>
       </w:r>
     </w:p>
     <w:p>
@@ -70,10 +68,10 @@
         <w:rPr>
           <w:rFonts w:ascii="Arial" w:cs="Arial" w:eastAsia="Arial" w:hAnsi="Arial"/>
           <w:color w:val="64748B"/>
-          <w:sz w:val="32"/>
-          <w:szCs w:val="32"/>
-        </w:rPr>
-        <w:t xml:space="preserve">Faculty Guide</w:t>
+          <w:sz w:val="28"/>
+          <w:szCs w:val="28"/>
+        </w:rPr>
+        <w:t xml:space="preserve">Faculty Guide · Version 1.0</w:t>
       </w:r>
     </w:p>
     <w:p>
@@ -190,7 +188,6 @@
     </w:p>
     <w:p>
       <w:pPr>
-        <w:spacing w:after="0"/>
         <w:jc w:val="center"/>
       </w:pPr>
       <w:r>
@@ -222,7 +219,7 @@
           <w:sz w:val="36"/>
           <w:szCs w:val="36"/>
         </w:rPr>
-        <w:t xml:space="preserve">1. What Is This Tool?</w:t>
+        <w:t xml:space="preserve">1. What Is RAG Tutor?</w:t>
       </w:r>
     </w:p>
     <w:p>
@@ -238,7 +235,7 @@
           <w:sz w:val="22"/>
           <w:szCs w:val="22"/>
         </w:rPr>
-        <w:t xml:space="preserve">The COP3337 Personalized Learning RAG Chatbot v2.0 is a browser-based AI tutoring assistant for Computer Programming II (Java). It uses Google Gemini to provide personalized, context-aware responses that adapt to each student’s learning history and topic mastery.</w:t>
+        <w:t xml:space="preserve">RAG Tutor is a free, browser-based, personalized AI learning assistant that works for any course in any discipline. It uses Google Gemini to provide context-aware tutoring that adapts to each student’s learning history, topic mastery, and interaction patterns.</w:t>
       </w:r>
     </w:p>
     <w:p>
@@ -254,7 +251,7 @@
           <w:sz w:val="22"/>
           <w:szCs w:val="22"/>
         </w:rPr>
-        <w:t xml:space="preserve">Unlike generic AI chatbots, this tool remembers what each student has studied, tracks their mastery progression across Java topics, offers a Socratic questioning mode, generates adaptive quizzes, and provides analytics dashboards for both students and instructors.</w:t>
+        <w:t xml:space="preserve">Unlike generic AI chatbots, RAG Tutor remembers what each student has studied, tracks their mastery progression across topics, offers a Socratic questioning mode, generates adaptive quizzes, prompts metacognitive reflection, and provides analytics dashboards for both students and instructors.</w:t>
       </w:r>
     </w:p>
     <w:p>
@@ -322,7 +319,7 @@
                 <w:sz w:val="21"/>
                 <w:szCs w:val="21"/>
               </w:rPr>
-              <w:t xml:space="preserve">Single HTML file — no installation, no server, no dependencies. Works in Chrome, Edge, or Firefox. Powered by Google Gemini (free tier). All student data stays in the browser (localStorage). Faculty can view aggregated analytics via the Instructor Dashboard.</w:t>
+              <w:t xml:space="preserve">Single HTML file — no installation, no server, no dependencies. Works in Chrome, Edge, or Firefox. Powered by Google Gemini (free tier). All student data stays in the browser (localStorage). Faculty can view aggregated analytics via the Instructor Dashboard. Works for any course in any discipline.</w:t>
             </w:r>
           </w:p>
         </w:tc>
@@ -363,7 +360,7 @@
           <w:sz w:val="22"/>
           <w:szCs w:val="22"/>
         </w:rPr>
-        <w:t xml:space="preserve">The tool requires a Google Gemini API key to power AI responses. This key is free, takes under 2 minutes to create, and requires no credit card.</w:t>
+        <w:t xml:space="preserve">RAG Tutor requires a Google Gemini API key to power AI responses. This key is free, takes under 2 minutes to create, and requires no credit card.</w:t>
       </w:r>
     </w:p>
     <w:p>
@@ -858,7 +855,7 @@
           <w:sz w:val="36"/>
           <w:szCs w:val="36"/>
         </w:rPr>
-        <w:t xml:space="preserve">3. Setting Up the Tool</w:t>
+        <w:t xml:space="preserve">3. Setting Up RAG Tutor</w:t>
       </w:r>
     </w:p>
     <w:p>
@@ -975,7 +972,7 @@
           <w:sz w:val="22"/>
           <w:szCs w:val="22"/>
         </w:rPr>
-        <w:t xml:space="preserve">Find COP3337_RAG_v2_Final.html</w:t>
+        <w:t xml:space="preserve">Find RAG_Tutor.html</w:t>
       </w:r>
     </w:p>
     <w:p>
@@ -1016,7 +1013,7 @@
           <w:sz w:val="22"/>
           <w:szCs w:val="22"/>
         </w:rPr>
-        <w:t xml:space="preserve">Double-click COP3337_RAG_v2_Final.html — it opens in your browser</w:t>
+        <w:t xml:space="preserve">Double-click RAG_Tutor.html — it opens in your browser</w:t>
       </w:r>
     </w:p>
     <w:p>
@@ -1095,7 +1092,7 @@
           <w:sz w:val="22"/>
           <w:szCs w:val="22"/>
         </w:rPr>
-        <w:t xml:space="preserve">Click Register and create a student account (full name, username, password)</w:t>
+        <w:t xml:space="preserve">Click Register and create an account (full name, username, password)</w:t>
       </w:r>
     </w:p>
     <w:p>
@@ -1190,7 +1187,7 @@
           <w:sz w:val="22"/>
           <w:szCs w:val="22"/>
         </w:rPr>
-        <w:t xml:space="preserve">Start asking questions!</w:t>
+        <w:t xml:space="preserve">Start asking questions about any subject!</w:t>
       </w:r>
     </w:p>
     <w:p>
@@ -1255,7 +1252,7 @@
           <w:sz w:val="22"/>
           <w:szCs w:val="22"/>
         </w:rPr>
-        <w:t xml:space="preserve">The main screen has a chat area on the left and a student sidebar on the right. Type any Java or OOP question and press Send or Enter. The AI adapts its response depth based on your demonstrated mastery level for that topic.</w:t>
+        <w:t xml:space="preserve">The main screen has a chat area on the left and a student sidebar on the right. Type any question from any subject and press Send or Enter. The AI adapts its response depth based on your demonstrated mastery level for that topic.</w:t>
       </w:r>
     </w:p>
     <w:p>
@@ -1293,7 +1290,7 @@
           <w:sz w:val="22"/>
           <w:szCs w:val="22"/>
         </w:rPr>
-        <w:t xml:space="preserve">Click the 🏛️ Socratic button in the header to toggle Socratic mode. When active (shown in gold), the AI will never give direct answers. Instead, it asks guiding questions to help you discover the answer yourself — modeling the Socratic method of teaching.</w:t>
+        <w:t xml:space="preserve">Click the 🏛️ Socratic button in the header to toggle Socratic mode. When active (shown in gold), the AI will never give direct answers. Instead, it asks guiding questions to help you discover the answer yourself.</w:t>
       </w:r>
     </w:p>
     <w:tbl>
@@ -1397,7 +1394,7 @@
           <w:sz w:val="22"/>
           <w:szCs w:val="22"/>
         </w:rPr>
-        <w:t xml:space="preserve">Click 📝 Quiz Me to generate 3 multiple-choice questions based on your most-studied topics. Each quiz includes Java code snippets, answer keys, and explanations. Quizzes adapt to your topic history — the more you study a topic, the more likely it appears in your quiz.</w:t>
+        <w:t xml:space="preserve">Click 📝 Quiz Me to generate 3 multiple-choice questions based on your most-studied topics. Each quiz includes answer keys and explanations. Quizzes adapt to your topic history and work for any discipline — the AI generates questions appropriate to whatever subject you have been studying.</w:t>
       </w:r>
     </w:p>
     <w:p>
@@ -1539,7 +1536,7 @@
           <w:sz w:val="22"/>
           <w:szCs w:val="22"/>
         </w:rPr>
-        <w:t xml:space="preserve">The tool includes 9 built-in color themes (6 light, 3 dark). Click the colored circles in the top bar to switch themes instantly. Your choice is saved automatically. Available themes:</w:t>
+        <w:t xml:space="preserve">RAG Tutor includes 9 built-in color themes (6 dark, 3 light). Click the colored circles in the top bar to switch themes instantly. Your choice is saved automatically. Available themes:</w:t>
       </w:r>
     </w:p>
     <w:p>
@@ -1558,7 +1555,7 @@
           <w:sz w:val="22"/>
           <w:szCs w:val="22"/>
         </w:rPr>
-        <w:t xml:space="preserve">FIU Blue and Gold (default)</w:t>
+        <w:t xml:space="preserve">Navy (default) — classic dark blue</w:t>
       </w:r>
     </w:p>
     <w:p>
@@ -1577,7 +1574,7 @@
           <w:sz w:val="22"/>
           <w:szCs w:val="22"/>
         </w:rPr>
-        <w:t xml:space="preserve">Emerald and Copper — warm and sophisticated</w:t>
+        <w:t xml:space="preserve">Ocean Blue — cool marine tones</w:t>
       </w:r>
     </w:p>
     <w:p>
@@ -1596,7 +1593,7 @@
           <w:sz w:val="22"/>
           <w:szCs w:val="22"/>
         </w:rPr>
-        <w:t xml:space="preserve">Sunset Coral — vibrant and energetic</w:t>
+        <w:t xml:space="preserve">Emerald — warm green and copper</w:t>
       </w:r>
     </w:p>
     <w:p>
@@ -1615,7 +1612,7 @@
           <w:sz w:val="22"/>
           <w:szCs w:val="22"/>
         </w:rPr>
-        <w:t xml:space="preserve">Royal Indigo — elegant purple tones</w:t>
+        <w:t xml:space="preserve">Royal Purple — elegant violet</w:t>
       </w:r>
     </w:p>
     <w:p>
@@ -1634,7 +1631,7 @@
           <w:sz w:val="22"/>
           <w:szCs w:val="22"/>
         </w:rPr>
-        <w:t xml:space="preserve">Ocean Teal — calm and focused</w:t>
+        <w:t xml:space="preserve">Rose — modern pink and slate</w:t>
       </w:r>
     </w:p>
     <w:p>
@@ -1653,7 +1650,7 @@
           <w:sz w:val="22"/>
           <w:szCs w:val="22"/>
         </w:rPr>
-        <w:t xml:space="preserve">Rose and Slate — modern and refined</w:t>
+        <w:t xml:space="preserve">Amber Gold — warm and authoritative</w:t>
       </w:r>
     </w:p>
     <w:p>
@@ -1672,7 +1669,7 @@
           <w:sz w:val="22"/>
           <w:szCs w:val="22"/>
         </w:rPr>
-        <w:t xml:space="preserve">Midnight (dark) — deep navy dark mode</w:t>
+        <w:t xml:space="preserve">Light Blue — clean light mode</w:t>
       </w:r>
     </w:p>
     <w:p>
@@ -1691,7 +1688,7 @@
           <w:sz w:val="22"/>
           <w:szCs w:val="22"/>
         </w:rPr>
-        <w:t xml:space="preserve">Charcoal (dark) — true dark mode</w:t>
+        <w:t xml:space="preserve">Light Warm — ivory and gold light mode</w:t>
       </w:r>
     </w:p>
     <w:p>
@@ -1710,7 +1707,7 @@
           <w:sz w:val="22"/>
           <w:szCs w:val="22"/>
         </w:rPr>
-        <w:t xml:space="preserve">Abyss (dark) — pure black OLED-friendly</w:t>
+        <w:t xml:space="preserve">Light Mint — fresh green light mode</w:t>
       </w:r>
     </w:p>
     <w:p>
@@ -2106,7 +2103,7 @@
                 <w:sz w:val="21"/>
                 <w:szCs w:val="21"/>
               </w:rPr>
-              <w:t xml:space="preserve">The Instructor Dashboard is designed to demonstrate to faculty colleagues how AI-assisted learning tools can provide actionable analytics. During a workshop or DBER presentation, create 2–3 test student accounts beforehand and ask a few questions with each to populate the dashboard with realistic data.</w:t>
+              <w:t xml:space="preserve">The Instructor Dashboard is designed to demonstrate to faculty colleagues how AI-assisted learning tools can provide actionable analytics. During a workshop or presentation, create 2–3 test student accounts beforehand and ask a few questions with each to populate the dashboard with realistic data.</w:t>
             </w:r>
           </w:p>
         </w:tc>
@@ -2147,7 +2144,7 @@
           <w:sz w:val="22"/>
           <w:szCs w:val="22"/>
         </w:rPr>
-        <w:t xml:space="preserve">The tool supports 6 Google Gemini models, each with its own separate free-tier quota:</w:t>
+        <w:t xml:space="preserve">RAG Tutor supports 6 Google Gemini models, each with its own separate free-tier quota:</w:t>
       </w:r>
     </w:p>
     <w:p>
@@ -2894,64 +2891,7 @@
           <w:sz w:val="22"/>
           <w:szCs w:val="22"/>
         </w:rPr>
-        <w:t xml:space="preserve">This tool can be adapted for any course by modifying three sections in the HTML file:</w:t>
-      </w:r>
-    </w:p>
-    <w:p>
-      <w:pPr>
-        <w:pStyle w:val="ListParagraph"/>
-        <w:numPr>
-          <w:ilvl w:val="0"/>
-          <w:numId w:val="4"/>
-        </w:numPr>
-        <w:spacing w:after="80" w:line="276"/>
-      </w:pPr>
-      <w:r>
-        <w:rPr>
-          <w:rFonts w:ascii="Arial" w:cs="Arial" w:eastAsia="Arial" w:hAnsi="Arial"/>
-          <w:color w:val="333333"/>
-          <w:sz w:val="22"/>
-          <w:szCs w:val="22"/>
-        </w:rPr>
-        <w:t xml:space="preserve">Topic Keywords: Edit the TP object to include your course’s key concepts (search for “const TP” in the code)</w:t>
-      </w:r>
-    </w:p>
-    <w:p>
-      <w:pPr>
-        <w:pStyle w:val="ListParagraph"/>
-        <w:numPr>
-          <w:ilvl w:val="0"/>
-          <w:numId w:val="4"/>
-        </w:numPr>
-        <w:spacing w:after="80" w:line="276"/>
-      </w:pPr>
-      <w:r>
-        <w:rPr>
-          <w:rFonts w:ascii="Arial" w:cs="Arial" w:eastAsia="Arial" w:hAnsi="Arial"/>
-          <w:color w:val="333333"/>
-          <w:sz w:val="22"/>
-          <w:szCs w:val="22"/>
-        </w:rPr>
-        <w:t xml:space="preserve">System Prompt: Modify the course name, instructor name, and subject area in the sendMsg() function</w:t>
-      </w:r>
-    </w:p>
-    <w:p>
-      <w:pPr>
-        <w:pStyle w:val="ListParagraph"/>
-        <w:numPr>
-          <w:ilvl w:val="0"/>
-          <w:numId w:val="4"/>
-        </w:numPr>
-        <w:spacing w:after="80" w:line="276"/>
-      </w:pPr>
-      <w:r>
-        <w:rPr>
-          <w:rFonts w:ascii="Arial" w:cs="Arial" w:eastAsia="Arial" w:hAnsi="Arial"/>
-          <w:color w:val="333333"/>
-          <w:sz w:val="22"/>
-          <w:szCs w:val="22"/>
-        </w:rPr>
-        <w:t xml:space="preserve">Quiz Prompts: Update the topic and difficulty level in the genQuiz() function</w:t>
+        <w:t xml:space="preserve">RAG Tutor works for any subject out of the box. The AI automatically detects topics from student questions and adapts its responses accordingly. No configuration is required.</w:t>
       </w:r>
     </w:p>
     <w:p>
@@ -2967,7 +2907,7 @@
           <w:sz w:val="22"/>
           <w:szCs w:val="22"/>
         </w:rPr>
-        <w:t xml:space="preserve">No programming expertise is required — you only need to change text strings.</w:t>
+        <w:t xml:space="preserve">For advanced customization, you can modify the system prompts in the HTML file to include course-specific instructions, required textbooks, or discipline-specific pedagogical approaches. Search for “RAG Tutor” in the code to find the prompt templates. No programming expertise is required — you only need to change text strings.</w:t>
       </w:r>
     </w:p>
     <w:p>
@@ -3026,7 +2966,7 @@
           <w:sz w:val="22"/>
           <w:szCs w:val="22"/>
         </w:rPr>
-        <w:t xml:space="preserve">Bahreini, K. (2026). COP3337 Personalized Learning RAG Chatbot (Version 2.0) [Software]. Knight Foundation School of Computing and Information Sciences, Florida International University. kbahrein@fiu.edu</w:t>
+        <w:t xml:space="preserve">Bahreini, K. (2026). RAG Tutor: A Personalized AI Learning Assistant (Version 1.0) [Software]. Knight Foundation School of Computing and Information Sciences, Florida International University. kbahrein@fiu.edu. https://github.com/KiavashBahreini7/rag-tutor</w:t>
       </w:r>
     </w:p>
     <w:p>
@@ -3061,7 +3001,44 @@
           <w:sz w:val="20"/>
           <w:szCs w:val="20"/>
         </w:rPr>
-        <w:t xml:space="preserve">@software{bahreini2026rag, author = {Bahreini, Kiavash}, title = {COP3337 Personalized Learning RAG Chatbot}, year = {2026}, version = {2.0}, institution = {KFSCIS, Florida International University}, license = {CC BY 4.0}}</w:t>
+        <w:t xml:space="preserve">@software{bahreini2026ragtutor, author = {Bahreini, Kiavash}, title = {RAG Tutor: A Personalized AI Learning Assistant}, year = {2026}, version = {1.0}, institution = {KFSCIS, Florida International University}, email = {kbahrein@fiu.edu}, url = {https://github.com/KiavashBahreini7/rag-tutor}, license = {CC BY 4.0}}</w:t>
+      </w:r>
+    </w:p>
+    <w:p>
+      <w:pPr>
+        <w:spacing w:after="80"/>
+      </w:pPr>
+    </w:p>
+    <w:p>
+      <w:pPr>
+        <w:spacing w:after="120" w:before="200"/>
+      </w:pPr>
+      <w:r>
+        <w:rPr>
+          <w:rFonts w:ascii="Arial" w:cs="Arial" w:eastAsia="Arial" w:hAnsi="Arial"/>
+          <w:b/>
+          <w:bCs/>
+          <w:color w:val="1E3A5F"/>
+          <w:sz w:val="24"/>
+          <w:szCs w:val="24"/>
+        </w:rPr>
+        <w:t xml:space="preserve">Chicago</w:t>
+      </w:r>
+    </w:p>
+    <w:p>
+      <w:pPr>
+        <w:spacing w:after="160" w:line="276"/>
+      </w:pPr>
+      <w:r>
+        <w:rPr>
+          <w:rFonts w:ascii="Arial" w:cs="Arial" w:eastAsia="Arial" w:hAnsi="Arial"/>
+          <w:b w:val="false"/>
+          <w:bCs w:val="false"/>
+          <w:color w:val="333333"/>
+          <w:sz w:val="22"/>
+          <w:szCs w:val="22"/>
+        </w:rPr>
+        <w:t xml:space="preserve">Bahreini, Kiavash. 2026. RAG Tutor: A Personalized AI Learning Assistant. Version 1.0. Software. Knight Foundation School of Computing and Information Sciences, Florida International University. https://github.com/KiavashBahreini7/rag-tutor</w:t>
       </w:r>
     </w:p>
     <w:p>
@@ -3083,7 +3060,61 @@
           <w:sz w:val="36"/>
           <w:szCs w:val="36"/>
         </w:rPr>
-        <w:t xml:space="preserve">10. License</w:t>
+        <w:t xml:space="preserve">10. Disclaimer</w:t>
+      </w:r>
+    </w:p>
+    <w:p>
+      <w:pPr>
+        <w:spacing w:after="160" w:line="276"/>
+      </w:pPr>
+      <w:r>
+        <w:rPr>
+          <w:rFonts w:ascii="Arial" w:cs="Arial" w:eastAsia="Arial" w:hAnsi="Arial"/>
+          <w:b w:val="false"/>
+          <w:bCs w:val="false"/>
+          <w:color w:val="333333"/>
+          <w:sz w:val="22"/>
+          <w:szCs w:val="22"/>
+        </w:rPr>
+        <w:t xml:space="preserve">This software is provided “as is”, without warranty of any kind, express or implied, including but not limited to the warranties of merchantability, fitness for a particular purpose, and noninfringement. In no event shall the author be liable for any claim, damages, or other liability, whether in an action of contract, tort, or otherwise, arising from, out of, or in connection with the software or the use or other dealings in the software.</w:t>
+      </w:r>
+    </w:p>
+    <w:p>
+      <w:pPr>
+        <w:spacing w:after="160" w:line="276"/>
+      </w:pPr>
+      <w:r>
+        <w:rPr>
+          <w:rFonts w:ascii="Arial" w:cs="Arial" w:eastAsia="Arial" w:hAnsi="Arial"/>
+          <w:b w:val="false"/>
+          <w:bCs w:val="false"/>
+          <w:color w:val="333333"/>
+          <w:sz w:val="22"/>
+          <w:szCs w:val="22"/>
+        </w:rPr>
+        <w:t xml:space="preserve">This tool relies on third-party AI services (Google Gemini API) which are subject to their own terms of service, usage limits, and availability. The author makes no guarantees regarding the accuracy, completeness, or reliability of AI-generated responses. Users are responsible for verifying all information provided by the tool.</w:t>
+      </w:r>
+    </w:p>
+    <w:p>
+      <w:pPr>
+        <w:spacing w:after="80"/>
+      </w:pPr>
+    </w:p>
+    <w:p>
+      <w:pPr>
+        <w:pStyle w:val="Heading1"/>
+        <w:spacing w:after="200" w:before="360"/>
+      </w:pPr>
+      <w:r>
+        <w:rPr>
+          <w:rFonts w:ascii="Arial" w:cs="Arial" w:eastAsia="Arial" w:hAnsi="Arial"/>
+          <w:b/>
+          <w:bCs/>
+          <w:color w:val="1E3A5F"/>
+          <w:sz w:val="36"/>
+          <w:szCs w:val="36"/>
+        </w:rPr>
+        <w:t xml:space="preserve">11. License</w:t>
       </w:r>
     </w:p>
     <w:p>

</xml_diff>